<commit_message>
fix: icindekiler duz metin olarak yeniden yazildi (Word field sorunu)
</commit_message>
<xml_diff>
--- a/Docs/MC_AWARE_Kisisel_Rapor.docx
+++ b/Docs/MC_AWARE_Kisisel_Rapor.docx
@@ -134,20 +134,490 @@
       </w:r>
     </w:p>
     <w:p>
-      <w:r>
-        <w:fldChar w:fldCharType="begin"/>
-      </w:r>
-      <w:r>
-        <w:instrText xml:space="preserve"> TOC \o "1-2" \h \z \u </w:instrText>
-      </w:r>
-      <w:r>
-        <w:fldChar w:fldCharType="separate"/>
-      </w:r>
-      <w:r>
-        <w:t>Bu tabloya tiklayin ve F9 tusuna basin (veya sag tik &gt; Alani Guncelle)</w:t>
-      </w:r>
-      <w:r>
-        <w:fldChar w:fldCharType="end"/>
+      <w:pPr>
+        <w:spacing w:after="60"/>
+      </w:pPr>
+      <w:r>
+        <w:rPr>
+          <w:b/>
+          <w:sz w:val="22"/>
+        </w:rPr>
+        <w:t xml:space="preserve">1. </w:t>
+      </w:r>
+      <w:r>
+        <w:rPr>
+          <w:sz w:val="22"/>
+        </w:rPr>
+        <w:t>Yönetici Özeti</w:t>
+      </w:r>
+    </w:p>
+    <w:p>
+      <w:pPr>
+        <w:spacing w:after="60"/>
+      </w:pPr>
+      <w:r>
+        <w:rPr>
+          <w:b/>
+          <w:sz w:val="22"/>
+        </w:rPr>
+        <w:t xml:space="preserve">2. </w:t>
+      </w:r>
+      <w:r>
+        <w:rPr>
+          <w:sz w:val="22"/>
+        </w:rPr>
+        <w:t>Giriş ve Motivasyon</w:t>
+      </w:r>
+    </w:p>
+    <w:p>
+      <w:pPr>
+        <w:spacing w:after="60"/>
+      </w:pPr>
+      <w:r>
+        <w:rPr>
+          <w:b/>
+          <w:sz w:val="22"/>
+        </w:rPr>
+        <w:t xml:space="preserve">3. </w:t>
+      </w:r>
+      <w:r>
+        <w:rPr>
+          <w:sz w:val="22"/>
+        </w:rPr>
+        <w:t>Literatür Taraması</w:t>
+      </w:r>
+    </w:p>
+    <w:p>
+      <w:pPr>
+        <w:ind w:left="720"/>
+        <w:spacing w:after="60"/>
+      </w:pPr>
+      <w:r>
+        <w:rPr>
+          <w:sz w:val="20"/>
+          <w:color w:val="555555"/>
+        </w:rPr>
+        <w:t>3.1 Finansal Zaman Serilerinde Derin Öğrenme</w:t>
+      </w:r>
+    </w:p>
+    <w:p>
+      <w:pPr>
+        <w:ind w:left="720"/>
+        <w:spacing w:after="60"/>
+      </w:pPr>
+      <w:r>
+        <w:rPr>
+          <w:sz w:val="20"/>
+          <w:color w:val="555555"/>
+        </w:rPr>
+        <w:t>3.2 Türkiye'de BIST Üzerine DL Çalışmaları</w:t>
+      </w:r>
+    </w:p>
+    <w:p>
+      <w:pPr>
+        <w:ind w:left="720"/>
+        <w:spacing w:after="60"/>
+      </w:pPr>
+      <w:r>
+        <w:rPr>
+          <w:sz w:val="20"/>
+          <w:color w:val="555555"/>
+        </w:rPr>
+        <w:t>3.3 Sınıf Dengesizliği ve MC Tuzağı</w:t>
+      </w:r>
+    </w:p>
+    <w:p>
+      <w:pPr>
+        <w:ind w:left="720"/>
+        <w:spacing w:after="60"/>
+      </w:pPr>
+      <w:r>
+        <w:rPr>
+          <w:sz w:val="20"/>
+          <w:color w:val="555555"/>
+        </w:rPr>
+        <w:t>3.4 Kısayol Öğrenme ve Sahte Korelasyonlar</w:t>
+      </w:r>
+    </w:p>
+    <w:p>
+      <w:pPr>
+        <w:ind w:left="720"/>
+        <w:spacing w:after="60"/>
+      </w:pPr>
+      <w:r>
+        <w:rPr>
+          <w:sz w:val="20"/>
+          <w:color w:val="555555"/>
+        </w:rPr>
+        <w:t>3.5 Kavram Kayması ve Piyasa Rejim Değişikliği</w:t>
+      </w:r>
+    </w:p>
+    <w:p>
+      <w:pPr>
+        <w:ind w:left="720"/>
+        <w:spacing w:after="60"/>
+      </w:pPr>
+      <w:r>
+        <w:rPr>
+          <w:sz w:val="20"/>
+          <w:color w:val="555555"/>
+        </w:rPr>
+        <w:t>3.6 Etkin Piyasa Hipotezi ve Anti-Prediktif Davranış</w:t>
+      </w:r>
+    </w:p>
+    <w:p>
+      <w:pPr>
+        <w:ind w:left="720"/>
+        <w:spacing w:after="60"/>
+      </w:pPr>
+      <w:r>
+        <w:rPr>
+          <w:sz w:val="20"/>
+          <w:color w:val="555555"/>
+        </w:rPr>
+        <w:t>3.7 Walk-Forward Doğrulama</w:t>
+      </w:r>
+    </w:p>
+    <w:p>
+      <w:pPr>
+        <w:ind w:left="720"/>
+        <w:spacing w:after="60"/>
+      </w:pPr>
+      <w:r>
+        <w:rPr>
+          <w:sz w:val="20"/>
+          <w:color w:val="555555"/>
+        </w:rPr>
+        <w:t>3.8 Seçici Tahmin ve Model Güvenilirliği</w:t>
+      </w:r>
+    </w:p>
+    <w:p>
+      <w:pPr>
+        <w:spacing w:after="60"/>
+      </w:pPr>
+      <w:r>
+        <w:rPr>
+          <w:b/>
+          <w:sz w:val="22"/>
+        </w:rPr>
+        <w:t xml:space="preserve">4. </w:t>
+      </w:r>
+      <w:r>
+        <w:rPr>
+          <w:sz w:val="22"/>
+        </w:rPr>
+        <w:t>Metodoloji</w:t>
+      </w:r>
+    </w:p>
+    <w:p>
+      <w:pPr>
+        <w:ind w:left="720"/>
+        <w:spacing w:after="60"/>
+      </w:pPr>
+      <w:r>
+        <w:rPr>
+          <w:sz w:val="20"/>
+          <w:color w:val="555555"/>
+        </w:rPr>
+        <w:t>4.1 Veri Kaynakları ve Özellik Mühendisliği</w:t>
+      </w:r>
+    </w:p>
+    <w:p>
+      <w:pPr>
+        <w:ind w:left="720"/>
+        <w:spacing w:after="60"/>
+      </w:pPr>
+      <w:r>
+        <w:rPr>
+          <w:sz w:val="20"/>
+          <w:color w:val="555555"/>
+        </w:rPr>
+        <w:t>4.2 Model Mimarileri</w:t>
+      </w:r>
+    </w:p>
+    <w:p>
+      <w:pPr>
+        <w:ind w:left="720"/>
+        <w:spacing w:after="60"/>
+      </w:pPr>
+      <w:r>
+        <w:rPr>
+          <w:sz w:val="20"/>
+          <w:color w:val="555555"/>
+        </w:rPr>
+        <w:t>4.3 MC-Aware Kayıp Fonksiyonu</w:t>
+      </w:r>
+    </w:p>
+    <w:p>
+      <w:pPr>
+        <w:ind w:left="720"/>
+        <w:spacing w:after="60"/>
+      </w:pPr>
+      <w:r>
+        <w:rPr>
+          <w:sz w:val="20"/>
+          <w:color w:val="555555"/>
+        </w:rPr>
+        <w:t>4.4 Walk-Forward Doğrulama</w:t>
+      </w:r>
+    </w:p>
+    <w:p>
+      <w:pPr>
+        <w:spacing w:after="60"/>
+      </w:pPr>
+      <w:r>
+        <w:rPr>
+          <w:b/>
+          <w:sz w:val="22"/>
+        </w:rPr>
+        <w:t xml:space="preserve">5. </w:t>
+      </w:r>
+      <w:r>
+        <w:rPr>
+          <w:sz w:val="22"/>
+        </w:rPr>
+        <w:t>Deneysel Bulgular</w:t>
+      </w:r>
+    </w:p>
+    <w:p>
+      <w:pPr>
+        <w:ind w:left="720"/>
+        <w:spacing w:after="60"/>
+      </w:pPr>
+      <w:r>
+        <w:rPr>
+          <w:sz w:val="20"/>
+          <w:color w:val="555555"/>
+        </w:rPr>
+        <w:t>5.1 MC Tuzağı Çözümü</w:t>
+      </w:r>
+    </w:p>
+    <w:p>
+      <w:pPr>
+        <w:ind w:left="720"/>
+        <w:spacing w:after="60"/>
+      </w:pPr>
+      <w:r>
+        <w:rPr>
+          <w:sz w:val="20"/>
+          <w:color w:val="555555"/>
+        </w:rPr>
+        <w:t>5.2 Anti-Prediktif Davranış</w:t>
+      </w:r>
+    </w:p>
+    <w:p>
+      <w:pPr>
+        <w:ind w:left="720"/>
+        <w:spacing w:after="60"/>
+      </w:pPr>
+      <w:r>
+        <w:rPr>
+          <w:sz w:val="20"/>
+          <w:color w:val="555555"/>
+        </w:rPr>
+        <w:t>5.3 Sektörel Ayrışma</w:t>
+      </w:r>
+    </w:p>
+    <w:p>
+      <w:pPr>
+        <w:ind w:left="720"/>
+        <w:spacing w:after="60"/>
+      </w:pPr>
+      <w:r>
+        <w:rPr>
+          <w:sz w:val="20"/>
+          <w:color w:val="555555"/>
+        </w:rPr>
+        <w:t>5.4 Özellik Ablasyonu</w:t>
+      </w:r>
+    </w:p>
+    <w:p>
+      <w:pPr>
+        <w:ind w:left="720"/>
+        <w:spacing w:after="60"/>
+      </w:pPr>
+      <w:r>
+        <w:rPr>
+          <w:sz w:val="20"/>
+          <w:color w:val="555555"/>
+        </w:rPr>
+        <w:t>5.5 Pencere Uzunluğu (IN_LEN) Ablasyonu</w:t>
+      </w:r>
+    </w:p>
+    <w:p>
+      <w:pPr>
+        <w:ind w:left="720"/>
+        <w:spacing w:after="60"/>
+      </w:pPr>
+      <w:r>
+        <w:rPr>
+          <w:sz w:val="20"/>
+          <w:color w:val="555555"/>
+        </w:rPr>
+        <w:t>5.6 Walk-Forward Sonuçları</w:t>
+      </w:r>
+    </w:p>
+    <w:p>
+      <w:pPr>
+        <w:ind w:left="720"/>
+        <w:spacing w:after="60"/>
+      </w:pPr>
+      <w:r>
+        <w:rPr>
+          <w:sz w:val="20"/>
+          <w:color w:val="555555"/>
+        </w:rPr>
+        <w:t>5.7 Ensemble ve Baseline Karşılaştırması</w:t>
+      </w:r>
+    </w:p>
+    <w:p>
+      <w:pPr>
+        <w:ind w:left="720"/>
+        <w:spacing w:after="60"/>
+      </w:pPr>
+      <w:r>
+        <w:rPr>
+          <w:sz w:val="20"/>
+          <w:color w:val="555555"/>
+        </w:rPr>
+        <w:t>5.8 Çapraz Piyasa Analizi</w:t>
+      </w:r>
+    </w:p>
+    <w:p>
+      <w:pPr>
+        <w:ind w:left="720"/>
+        <w:spacing w:after="60"/>
+      </w:pPr>
+      <w:r>
+        <w:rPr>
+          <w:sz w:val="20"/>
+          <w:color w:val="555555"/>
+        </w:rPr>
+        <w:t>5.9 Sektörel Detay Analizleri</w:t>
+      </w:r>
+    </w:p>
+    <w:p>
+      <w:pPr>
+        <w:spacing w:after="60"/>
+      </w:pPr>
+      <w:r>
+        <w:rPr>
+          <w:b/>
+          <w:sz w:val="22"/>
+        </w:rPr>
+        <w:t xml:space="preserve">6. </w:t>
+      </w:r>
+      <w:r>
+        <w:rPr>
+          <w:sz w:val="22"/>
+        </w:rPr>
+        <w:t>İstatistiksel Doğrulama</w:t>
+      </w:r>
+    </w:p>
+    <w:p>
+      <w:pPr>
+        <w:ind w:left="720"/>
+        <w:spacing w:after="60"/>
+      </w:pPr>
+      <w:r>
+        <w:rPr>
+          <w:sz w:val="20"/>
+          <w:color w:val="555555"/>
+        </w:rPr>
+        <w:t>6.1 Binom Testi</w:t>
+      </w:r>
+    </w:p>
+    <w:p>
+      <w:pPr>
+        <w:ind w:left="720"/>
+        <w:spacing w:after="60"/>
+      </w:pPr>
+      <w:r>
+        <w:rPr>
+          <w:sz w:val="20"/>
+          <w:color w:val="555555"/>
+        </w:rPr>
+        <w:t>6.2 McNemar Testi</w:t>
+      </w:r>
+    </w:p>
+    <w:p>
+      <w:pPr>
+        <w:ind w:left="720"/>
+        <w:spacing w:after="60"/>
+      </w:pPr>
+      <w:r>
+        <w:rPr>
+          <w:sz w:val="20"/>
+          <w:color w:val="555555"/>
+        </w:rPr>
+        <w:t>6.3 Karşılıklı Bilgi (MI) Analizi</w:t>
+      </w:r>
+    </w:p>
+    <w:p>
+      <w:pPr>
+        <w:ind w:left="720"/>
+        <w:spacing w:after="60"/>
+      </w:pPr>
+      <w:r>
+        <w:rPr>
+          <w:sz w:val="20"/>
+          <w:color w:val="555555"/>
+        </w:rPr>
+        <w:t>6.4 Ek Diagnostik Görseller</w:t>
+      </w:r>
+    </w:p>
+    <w:p>
+      <w:pPr>
+        <w:spacing w:after="60"/>
+      </w:pPr>
+      <w:r>
+        <w:rPr>
+          <w:b/>
+          <w:sz w:val="22"/>
+        </w:rPr>
+        <w:t xml:space="preserve">7. </w:t>
+      </w:r>
+      <w:r>
+        <w:rPr>
+          <w:sz w:val="22"/>
+        </w:rPr>
+        <w:t>Araştırmanın Kısıtları ve Gelecek Çalışmalar (15 Kısıt)</w:t>
+      </w:r>
+    </w:p>
+    <w:p>
+      <w:pPr>
+        <w:spacing w:after="60"/>
+      </w:pPr>
+      <w:r>
+        <w:rPr>
+          <w:b/>
+          <w:sz w:val="22"/>
+        </w:rPr>
+        <w:t xml:space="preserve">8. </w:t>
+      </w:r>
+      <w:r>
+        <w:rPr>
+          <w:sz w:val="22"/>
+        </w:rPr>
+        <w:t>Sonuç</w:t>
+      </w:r>
+    </w:p>
+    <w:p>
+      <w:pPr>
+        <w:spacing w:after="60"/>
+      </w:pPr>
+      <w:r>
+        <w:rPr>
+          <w:b/>
+          <w:sz w:val="22"/>
+        </w:rPr>
+        <w:t xml:space="preserve">9. </w:t>
+      </w:r>
+      <w:r>
+        <w:rPr>
+          <w:sz w:val="22"/>
+        </w:rPr>
+        <w:t>Kaynakça (15 Referans — DOI + Projemizle İlişkisi)</w:t>
       </w:r>
     </w:p>
     <w:p>

</xml_diff>

<commit_message>
refactor: kapsamlı güncelleme — 7/21 BIST, 7 mimari, 62 görsel, raporlar güncel
Değişiklikler:
- BiLSTM_v1.R: OUTDIR_SUM/OUTDIR_DIAG kritik bug düzeltildi
- app.py: 5/11→7/21 BIST, 6→7 mimari, narrative box TR/EN, hero metrikleri t() çeviriye
- app.py: galeri sekmesine 10 yeni CSV-tabanlı görsel eklendi
- Dockerfile: build-essential kaldırıldı, .dockerignore oluşturuldu
- README.md: dosya/görsel sayıları güncellendi (62 görsel, 61 kod)
- TUBITAK_2209A_Sonuc_Raporu.docx: 12 tab, 62 görsel, 260 dosya, 7 mimari
- MC_AWARE_Kisisel_Rapor.docx: 7 DL mimarisi, 21 BIST hissesi
- PROJE_DURUMU.txt: sektörel bulgular genişletildi, çalışma günlüğü eklendi
- Yeni görseller: 49-58 (CSV matplotlib), INF01-09 (infografik), CSV_01-10
- Yeni scriptler: gorsel_uretici.py, gorsel_uretici_v2.py
</commit_message>
<xml_diff>
--- a/Docs/MC_AWARE_Kisisel_Rapor.docx
+++ b/Docs/MC_AWARE_Kisisel_Rapor.docx
@@ -645,7 +645,7 @@
           <w:i w:val="0"/>
           <w:sz w:val="22"/>
         </w:rPr>
-        <w:t>Proje kapsamında 6 farklı derin öğrenme mimarisi (BiLSTM, GRU, Conv1D, TCN, Transformer, SimpleRNN), 27 farklı varlık (11 BIST hissesi, 1 NASDAQ, 3 BES fonu, 12 sektörel test) ve 700+ konfigürasyon üzerinde 30+ deney serisi yürütülmüştür. Tüm deneyler 130 CSV dosyasında belgelenmiş olup, 52 makale kalitesinde görsel üretilmiştir.</w:t>
+        <w:t>Proje kapsamında 7 farklı derin öğrenme mimarisi (BiLSTM, GRU, Conv1D, TCN, Transformer, SimpleRNN), 27 farklı varlık (21 BIST hissesi, 1 NASDAQ, 3 BES fonu, 12 sektörel test) ve 700+ konfigürasyon üzerinde 30+ deney serisi yürütülmüştür. Tüm deneyler 130 CSV dosyasında belgelenmiş olup, 52 makale kalitesinde görsel üretilmiştir.</w:t>
       </w:r>
     </w:p>
     <w:p>
@@ -667,7 +667,7 @@
         </w:rPr>
         <w:t>• MC Tuzağı: class_weight=balanced ile 700+ konfigürasyonda tamamen çözüldü.</w:t>
         <w:br/>
-        <w:t>• Anti-Prediktif Davranış: 5/11 BIST hissesinde model, rastgeleden sistematik olarak kötü tahmin yapmakta; tahminlerin ters çevrilmesiyle doğruluk %60'a ulaşmaktadır.</w:t>
+        <w:t>• Anti-Prediktif Davranış: 5/21 BIST hissesinde model, rastgeleden sistematik olarak kötü tahmin yapmakta; tahminlerin ters çevrilmesiyle doğruluk %60'a ulaşmaktadır.</w:t>
         <w:br/>
         <w:t>• Mekanizma: Makroekonomik değişkenlerin (USD/TRY, petrol, faiz) eğitim-test dönemleri arasındaki korelasyon kırılması (USDTRY: eğitim r=0.91 → test r=0.41).</w:t>
         <w:br/>
@@ -1374,7 +1374,7 @@
           <w:i w:val="0"/>
           <w:sz w:val="22"/>
         </w:rPr>
-        <w:t>Tashman (2000), zaman serisi tahmininde walk-forward doğrulamanın standart k-fold cross-validation'a göre daha güvenilir sonuçlar verdiğini göstermiştir. Cerqueira, Torgo ve Mozetič (2020), walk-forward'ın veri sızıntısını önlemedeki kritik rolünü vurgulamıştır. Projemizde 7-fold walk-forward v2 yaklaşımı, val_data düzeltmesi ile uygulanmış ve her fold 6 mimari × 3 seed ile test edilmiştir.</w:t>
+        <w:t>Tashman (2000), zaman serisi tahmininde walk-forward doğrulamanın standart k-fold cross-validation'a göre daha güvenilir sonuçlar verdiğini göstermiştir. Cerqueira, Torgo ve Mozetič (2020), walk-forward'ın veri sızıntısını önlemedeki kritik rolünü vurgulamıştır. Projemizde 7-fold walk-forward v2 yaklaşımı, val_data düzeltmesi ile uygulanmış ve her fold 7 mimari × 3 seed ile test edilmiştir.</w:t>
       </w:r>
     </w:p>
     <w:p>
@@ -2529,7 +2529,7 @@
           <w:i w:val="0"/>
           <w:sz w:val="22"/>
         </w:rPr>
-        <w:t>Finansal veride standart k-fold cross-validation veri sızıntısına (data leakage) neden olur çünkü gelecek veri eğitimde kullanılabilir. Walk-Forward yaklaşımında eğitim penceresi her fold'da ileriye kayar ve model asla geleceği görmez. Projede 7-fold walk-forward v2 kullanılmıştır: her fold 6 mimari × 3 seed = 18 deney içerir (toplam 126 deney).</w:t>
+        <w:t>Finansal veride standart k-fold cross-validation veri sızıntısına (data leakage) neden olur çünkü gelecek veri eğitimde kullanılabilir. Walk-Forward yaklaşımında eğitim penceresi her fold'da ileriye kayar ve model asla geleceği görmez. Projede 7-fold walk-forward v2 kullanılmıştır: her fold 7 mimari × 3 seed = 18 deney içerir (toplam 126 deney).</w:t>
       </w:r>
     </w:p>
     <w:p>
@@ -2755,7 +2755,7 @@
           <w:i w:val="0"/>
           <w:sz w:val="22"/>
         </w:rPr>
-        <w:t>11 BIST hissesi üzerinde yapılan kapsamlı test, anti-prediktif davranışın sektörel bir örüntü izlediğini ortaya koymuştur. Havacılık (THYAO, PGSUS) ve spekülatif (SASA, HEKTS) hisselerinde %100 anti-prediktif davranış gözlenirken, bankacılık (YKBNK) ve otomotiv (FROTO) sektörlerinde normal davranış sergilenmektedir.</w:t>
+        <w:t>21 BIST hissesi üzerinde yapılan kapsamlı test, anti-prediktif davranışın sektörel bir örüntü izlediğini ortaya koymuştur. Havacılık (THYAO, PGSUS) ve spekülatif (SASA, HEKTS) hisselerinde %100 anti-prediktif davranış gözlenirken, bankacılık (YKBNK) ve otomotiv (FROTO) sektörlerinde normal davranış sergilenmektedir.</w:t>
       </w:r>
     </w:p>
     <w:tbl>
@@ -5700,7 +5700,7 @@
           <w:i w:val="0"/>
           <w:sz w:val="22"/>
         </w:rPr>
-        <w:t>6 DL mimarisinin tahminleri arasındaki istatistiksel fark McNemar testi ile incelenmiştir. Sonuçlar, mimarilerin benzer hata kalıplarına sahip olduğunu — yani anti-prediktif davranışın mimariden bağımsız olduğunu — göstermiştir.</w:t>
+        <w:t>7 DL mimarisinin tahminleri arasındaki istatistiksel fark McNemar testi ile incelenmiştir. Sonuçlar, mimarilerin benzer hata kalıplarına sahip olduğunu — yani anti-prediktif davranışın mimariden bağımsız olduğunu — göstermiştir.</w:t>
       </w:r>
     </w:p>
     <w:p>
@@ -6628,7 +6628,7 @@
           <w:i w:val="0"/>
           <w:sz w:val="22"/>
         </w:rPr>
-        <w:t>Bu araştırma, TÜBİTAK 2209-A programı kapsamında lisans düzeyinde gerçekleştirilmiş kapsamlı bir çalışmadır. 6 DL mimarisi, 27 varlık, 700+ konfigürasyon ve 130 CSV çıktısı ile BIST'te derin öğrenme modellerinin anti-prediktif davranışı sistematik olarak incelenmiştir.</w:t>
+        <w:t>Bu araştırma, TÜBİTAK 2209-A programı kapsamında lisans düzeyinde gerçekleştirilmiş kapsamlı bir çalışmadır. 7 DL mimarisi, 27 varlık, 700+ konfigürasyon ve 130 CSV çıktısı ile BIST'te derin öğrenme modellerinin anti-prediktif davranışı sistematik olarak incelenmiştir.</w:t>
       </w:r>
     </w:p>
     <w:p>
@@ -6650,13 +6650,13 @@
         </w:rPr>
         <w:t>1. MC Tuzağı Çözümü: class_weight=balanced ile 700+ konfigürasyonda MC=0 sağlanmıştır.</w:t>
         <w:br/>
-        <w:t>2. Anti-Prediktif Davranışın Tespiti: 5/11 BIST hissesinde sistematik ters tahmin.</w:t>
+        <w:t>2. Anti-Prediktif Davranışın Tespiti: 5/21 BIST hissesinde sistematik ters tahmin.</w:t>
         <w:br/>
         <w:t>3. Mekanizma Analizi: Makro korelasyon kırılması mekanizması kanıtlanmıştır.</w:t>
         <w:br/>
         <w:t>4. Sektörel Harita: Havacılık ve spekülatif sektörler risk altında.</w:t>
         <w:br/>
-        <w:t>5. Mimariden Bağımsızlık: 6 DL mimarisinde aynı örüntü.</w:t>
+        <w:t>5. Mimariden Bağımsızlık: 7 DL mimarisinde aynı örüntü.</w:t>
         <w:br/>
         <w:t>6. Pencere Uzunluğu Etkisi: IN_LEN ≤ 5 anti-prediktif tetikler, IN_LEN=10 normalleştirir.</w:t>
         <w:br/>

</xml_diff>

<commit_message>
fix: audit buglari duzeltildi — README 7/21, docx 21 BIST, app.py 7 mimari, kod sayisi 62
</commit_message>
<xml_diff>
--- a/Docs/MC_AWARE_Kisisel_Rapor.docx
+++ b/Docs/MC_AWARE_Kisisel_Rapor.docx
@@ -3565,7 +3565,7 @@
           <w:color w:val="666666"/>
           <w:sz w:val="18"/>
         </w:rPr>
-        <w:t>Şekil 9: 11 BIST Hissesi — Naive, Model ve Flip Doğruluk Karşılaştırması</w:t>
+        <w:t>Şekil 9: 21 BIST Hissesi — Naive, Model ve Flip Doğruluk Karşılaştırması</w:t>
       </w:r>
     </w:p>
     <w:p/>
@@ -3671,7 +3671,7 @@
           <w:color w:val="666666"/>
           <w:sz w:val="18"/>
         </w:rPr>
-        <w:t>Şekil 11: Seed Varyansı — 11 BIST Hissesi</w:t>
+        <w:t>Şekil 11: Seed Varyansı — 21 BIST Hissesi</w:t>
       </w:r>
     </w:p>
     <w:p/>

</xml_diff>